<commit_message>
feat: Diagrama de secuencia
</commit_message>
<xml_diff>
--- a/docs/Diagrama de casos de uso.docx
+++ b/docs/Diagrama de casos de uso.docx
@@ -551,9 +551,12 @@
     <w:sdt>
       <w:sdtPr>
         <w:rPr>
-          <w:rFonts w:eastAsia="Arial" w:cs="Arial"/>
-          <w:b/>
+          <w:rFonts w:asciiTheme="minorHAnsi" w:eastAsia="Arial" w:hAnsiTheme="minorHAnsi" w:cs="Arial"/>
+          <w:b/>
+          <w:kern w:val="2"/>
           <w:szCs w:val="22"/>
+          <w:lang w:val="en-US" w:eastAsia="en-US"/>
+          <w14:ligatures w14:val="standardContextual"/>
         </w:rPr>
         <w:id w:val="-103424025"/>
         <w:docPartObj>
@@ -567,9 +570,6 @@
           <w:b w:val="0"/>
           <w:bCs/>
           <w:noProof/>
-          <w:kern w:val="2"/>
-          <w:lang w:val="en-US" w:eastAsia="en-US"/>
-          <w14:ligatures w14:val="standardContextual"/>
         </w:rPr>
       </w:sdtEndPr>
       <w:sdtContent>
@@ -599,7 +599,7 @@
               <w:tab w:val="right" w:leader="dot" w:pos="10070"/>
             </w:tabs>
             <w:rPr>
-              <w:rFonts w:eastAsiaTheme="minorEastAsia"/>
+              <w:rFonts w:asciiTheme="minorHAnsi" w:eastAsiaTheme="minorEastAsia" w:hAnsiTheme="minorHAnsi" w:cstheme="minorBidi"/>
               <w:noProof/>
               <w:kern w:val="2"/>
               <w:sz w:val="24"/>
@@ -619,14 +619,14 @@
           <w:r>
             <w:fldChar w:fldCharType="separate"/>
           </w:r>
-          <w:hyperlink w:anchor="_Toc220307871" w:history="1">
+          <w:hyperlink w:anchor="_Toc220311661" w:history="1">
             <w:r>
               <w:rPr>
                 <w:rStyle w:val="Hyperlink"/>
                 <w:noProof/>
                 <w:lang w:val="es-VE"/>
               </w:rPr>
-              <w:t>Diagrama de casos de uso</w:t>
+              <w:t>Diagrama de Casos de Uso</w:t>
             </w:r>
             <w:r>
               <w:rPr>
@@ -647,7 +647,7 @@
                 <w:noProof/>
                 <w:webHidden/>
               </w:rPr>
-              <w:instrText xml:space="preserve"> PAGEREF _Toc220307871 \h </w:instrText>
+              <w:instrText xml:space="preserve"> PAGEREF _Toc220311661 \h </w:instrText>
             </w:r>
             <w:r>
               <w:rPr>
@@ -685,7 +685,7 @@
               <w:tab w:val="right" w:leader="dot" w:pos="10070"/>
             </w:tabs>
             <w:rPr>
-              <w:rFonts w:eastAsiaTheme="minorEastAsia"/>
+              <w:rFonts w:asciiTheme="minorHAnsi" w:eastAsiaTheme="minorEastAsia" w:hAnsiTheme="minorHAnsi" w:cstheme="minorBidi"/>
               <w:noProof/>
               <w:kern w:val="2"/>
               <w:sz w:val="24"/>
@@ -693,7 +693,7 @@
               <w14:ligatures w14:val="standardContextual"/>
             </w:rPr>
           </w:pPr>
-          <w:hyperlink w:anchor="_Toc220307872" w:history="1">
+          <w:hyperlink w:anchor="_Toc220311662" w:history="1">
             <w:r>
               <w:rPr>
                 <w:rStyle w:val="Hyperlink"/>
@@ -721,7 +721,7 @@
                 <w:noProof/>
                 <w:webHidden/>
               </w:rPr>
-              <w:instrText xml:space="preserve"> PAGEREF _Toc220307872 \h </w:instrText>
+              <w:instrText xml:space="preserve"> PAGEREF _Toc220311662 \h </w:instrText>
             </w:r>
             <w:r>
               <w:rPr>
@@ -759,11 +759,14 @@
               <w:tab w:val="right" w:leader="dot" w:pos="10070"/>
             </w:tabs>
             <w:rPr>
-              <w:rFonts w:ascii="Arial" w:hAnsi="Arial" w:cs="Arial"/>
+              <w:rFonts w:ascii="Arial" w:eastAsiaTheme="minorEastAsia" w:hAnsi="Arial" w:cs="Arial"/>
               <w:noProof/>
+              <w:sz w:val="24"/>
+              <w:szCs w:val="24"/>
+              <w:lang w:val="es-ES" w:eastAsia="es-ES"/>
             </w:rPr>
           </w:pPr>
-          <w:hyperlink w:anchor="_Toc220307873" w:history="1">
+          <w:hyperlink w:anchor="_Toc220311663" w:history="1">
             <w:r>
               <w:rPr>
                 <w:rStyle w:val="Hyperlink"/>
@@ -795,7 +798,7 @@
                 <w:noProof/>
                 <w:webHidden/>
               </w:rPr>
-              <w:instrText xml:space="preserve"> PAGEREF _Toc220307873 \h </w:instrText>
+              <w:instrText xml:space="preserve"> PAGEREF _Toc220311663 \h </w:instrText>
             </w:r>
             <w:r>
               <w:rPr>
@@ -837,11 +840,14 @@
               <w:tab w:val="right" w:leader="dot" w:pos="10070"/>
             </w:tabs>
             <w:rPr>
-              <w:rFonts w:ascii="Arial" w:hAnsi="Arial" w:cs="Arial"/>
+              <w:rFonts w:ascii="Arial" w:eastAsiaTheme="minorEastAsia" w:hAnsi="Arial" w:cs="Arial"/>
               <w:noProof/>
+              <w:sz w:val="24"/>
+              <w:szCs w:val="24"/>
+              <w:lang w:val="es-ES" w:eastAsia="es-ES"/>
             </w:rPr>
           </w:pPr>
-          <w:hyperlink w:anchor="_Toc220307874" w:history="1">
+          <w:hyperlink w:anchor="_Toc220311664" w:history="1">
             <w:r>
               <w:rPr>
                 <w:rStyle w:val="Hyperlink"/>
@@ -873,7 +879,7 @@
                 <w:noProof/>
                 <w:webHidden/>
               </w:rPr>
-              <w:instrText xml:space="preserve"> PAGEREF _Toc220307874 \h </w:instrText>
+              <w:instrText xml:space="preserve"> PAGEREF _Toc220311664 \h </w:instrText>
             </w:r>
             <w:r>
               <w:rPr>
@@ -963,13 +969,37 @@
           <w:lang w:val="es-VE"/>
         </w:rPr>
       </w:pPr>
-      <w:bookmarkStart w:id="0" w:name="_Toc220307871"/>
+      <w:bookmarkStart w:id="0" w:name="_Toc220311661"/>
       <w:r>
         <w:rPr>
           <w:lang w:val="es-VE"/>
         </w:rPr>
         <w:lastRenderedPageBreak/>
-        <w:t>Diagrama de casos de uso</w:t>
+        <w:t xml:space="preserve">Diagrama de </w:t>
+      </w:r>
+      <w:r>
+        <w:rPr>
+          <w:lang w:val="es-VE"/>
+        </w:rPr>
+        <w:t>C</w:t>
+      </w:r>
+      <w:r>
+        <w:rPr>
+          <w:lang w:val="es-VE"/>
+        </w:rPr>
+        <w:t xml:space="preserve">asos de </w:t>
+      </w:r>
+      <w:r>
+        <w:rPr>
+          <w:lang w:val="es-VE"/>
+        </w:rPr>
+        <w:t>U</w:t>
+      </w:r>
+      <w:r>
+        <w:rPr>
+          <w:lang w:val="es-VE"/>
+        </w:rPr>
+        <w:t>so</w:t>
       </w:r>
       <w:bookmarkEnd w:id="0"/>
       <w:r>
@@ -1083,7 +1113,7 @@
           <w:lang w:val="es-VE"/>
         </w:rPr>
       </w:pPr>
-      <w:bookmarkStart w:id="1" w:name="_Toc220307872"/>
+      <w:bookmarkStart w:id="1" w:name="_Toc220311662"/>
       <w:r>
         <w:rPr>
           <w:lang w:val="es-VE"/>
@@ -1109,7 +1139,7 @@
           <w:lang w:val="es-VE"/>
         </w:rPr>
       </w:pPr>
-      <w:bookmarkStart w:id="2" w:name="_Toc220307873"/>
+      <w:bookmarkStart w:id="2" w:name="_Toc220311663"/>
       <w:r>
         <w:rPr>
           <w:lang w:val="es-VE"/>
@@ -1404,7 +1434,7 @@
           <w:lang w:val="es-VE"/>
         </w:rPr>
       </w:pPr>
-      <w:bookmarkStart w:id="3" w:name="_Toc220307874"/>
+      <w:bookmarkStart w:id="3" w:name="_Toc220311664"/>
       <w:r>
         <w:rPr>
           <w:lang w:val="es-VE"/>

</xml_diff>

<commit_message>
fix: Cambios de redacción
</commit_message>
<xml_diff>
--- a/docs/Diagrama de casos de uso.docx
+++ b/docs/Diagrama de casos de uso.docx
@@ -1293,7 +1293,21 @@
                 <w:rFonts w:ascii="Arial" w:hAnsi="Arial" w:cs="Arial"/>
                 <w:lang w:val="es-VE"/>
               </w:rPr>
-              <w:t>Usuario que registra, da seguimiento, cierra y reabre casos asignados.</w:t>
+              <w:t>Usuario que registra</w:t>
+            </w:r>
+            <w:r>
+              <w:rPr>
+                <w:rFonts w:ascii="Arial" w:hAnsi="Arial" w:cs="Arial"/>
+                <w:lang w:val="es-VE"/>
+              </w:rPr>
+              <w:t xml:space="preserve"> y</w:t>
+            </w:r>
+            <w:r>
+              <w:rPr>
+                <w:rFonts w:ascii="Arial" w:hAnsi="Arial" w:cs="Arial"/>
+                <w:lang w:val="es-VE"/>
+              </w:rPr>
+              <w:t xml:space="preserve"> da seguimiento casos asignados.</w:t>
             </w:r>
           </w:p>
         </w:tc>
@@ -4018,7 +4032,14 @@
           <w:rFonts w:ascii="Arial" w:hAnsi="Arial" w:cs="Arial"/>
           <w:lang w:val="es-VE"/>
         </w:rPr>
-        <w:t>El usuario selecciona un tipo y define filtros (rango de fechas, etc.).</w:t>
+        <w:t>El usuario selecciona un tipo</w:t>
+      </w:r>
+      <w:r>
+        <w:rPr>
+          <w:rFonts w:ascii="Arial" w:hAnsi="Arial" w:cs="Arial"/>
+          <w:lang w:val="es-VE"/>
+        </w:rPr>
+        <w:t>.</w:t>
       </w:r>
     </w:p>
     <w:p>

</xml_diff>